<commit_message>
Polish 2 ban MauQD: (1) Dieu 3 bullets dung dau ; va . cuoi cung thay vi : (theo cong van chinh phu VN); (2) BAN MAU Dieu 5 dung [...] thay vi hardcode 'Khoa TLGD/Phong KHCN'; (3) Them caveat TT43/2024 ap dung cho y sinh hoc - NCS tam ly giao duc can xac minh voi Phong KHCN truong
</commit_message>
<xml_diff>
--- a/bai-bao-Q1/MauQD_HoiDongDaoDuc_BANMAU_08062026.docx
+++ b/bai-bao-Q1/MauQD_HoiDongDaoDuc_BANMAU_08062026.docx
@@ -451,15 +451,9 @@
       </w:pPr>
       <w:r>
         <w:rPr>
-          <w:b/>
           <w:sz w:val="24"/>
         </w:rPr>
-        <w:t xml:space="preserve">• Thu thập sự đồng ý bằng văn bản (informed consent) của cha/mẹ/người giám hộ và sự đồng thuận bằng văn bản (assent) của học sinh trước khi tiến hành thu dữ liệu: </w:t>
-      </w:r>
-      <w:r>
-        <w:rPr>
-          <w:sz w:val="24"/>
-        </w:rPr>
+        <w:t>• Thu thập sự đồng ý bằng văn bản (informed consent) của cha/mẹ/người giám hộ và sự đồng thuận bằng văn bản (assent) của học sinh trước khi tiến hành thu dữ liệu;</w:t>
       </w:r>
     </w:p>
     <w:p>
@@ -470,15 +464,9 @@
       </w:pPr>
       <w:r>
         <w:rPr>
-          <w:b/>
           <w:sz w:val="24"/>
         </w:rPr>
-        <w:t xml:space="preserve">• Bảo mật thông tin cá nhân của đối tượng nghiên cứu theo quy định: </w:t>
-      </w:r>
-      <w:r>
-        <w:rPr>
-          <w:sz w:val="24"/>
-        </w:rPr>
+        <w:t>• Bảo mật thông tin cá nhân của đối tượng nghiên cứu theo quy định hiện hành;</w:t>
       </w:r>
     </w:p>
     <w:p>
@@ -489,15 +477,9 @@
       </w:pPr>
       <w:r>
         <w:rPr>
-          <w:b/>
           <w:sz w:val="24"/>
         </w:rPr>
-        <w:t xml:space="preserve">• Báo cáo tiến độ thực hiện đề tài hàng năm cho Hội đồng Đạo đức: </w:t>
-      </w:r>
-      <w:r>
-        <w:rPr>
-          <w:sz w:val="24"/>
-        </w:rPr>
+        <w:t>• Báo cáo tiến độ thực hiện đề tài hàng năm cho Hội đồng Đạo đức;</w:t>
       </w:r>
     </w:p>
     <w:p>
@@ -508,15 +490,9 @@
       </w:pPr>
       <w:r>
         <w:rPr>
-          <w:b/>
           <w:sz w:val="24"/>
         </w:rPr>
-        <w:t xml:space="preserve">• Thông báo kịp thời cho Hội đồng Đạo đức bất kỳ sự kiện bất lợi nào hoặc thay đổi đối với đề cương đã được phê duyệt: </w:t>
-      </w:r>
-      <w:r>
-        <w:rPr>
-          <w:sz w:val="24"/>
-        </w:rPr>
+        <w:t>• Thông báo kịp thời cho Hội đồng Đạo đức bất kỳ sự kiện bất lợi nào hoặc thay đổi đối với đề cương đã được phê duyệt;</w:t>
       </w:r>
     </w:p>
     <w:p>
@@ -527,15 +503,9 @@
       </w:pPr>
       <w:r>
         <w:rPr>
-          <w:b/>
           <w:sz w:val="24"/>
         </w:rPr>
-        <w:t xml:space="preserve">• Lưu trữ hồ sơ nghiên cứu trong thời hạn tối thiểu 05 năm kể từ ngày hoàn thành nghiên cứu: </w:t>
-      </w:r>
-      <w:r>
-        <w:rPr>
-          <w:sz w:val="24"/>
-        </w:rPr>
+        <w:t>• Lưu trữ hồ sơ nghiên cứu trong thời hạn tối thiểu 05 năm kể từ ngày hoàn thành nghiên cứu;</w:t>
       </w:r>
     </w:p>
     <w:p>
@@ -546,15 +516,9 @@
       </w:pPr>
       <w:r>
         <w:rPr>
-          <w:b/>
           <w:sz w:val="24"/>
         </w:rPr>
-        <w:t xml:space="preserve">• Tuân thủ Tuyên bố Helsinki (1964 và các sửa đổi) và Quy chế thực hành lâm sàng tốt (GCP): </w:t>
-      </w:r>
-      <w:r>
-        <w:rPr>
-          <w:sz w:val="24"/>
-        </w:rPr>
+        <w:t>• Tuân thủ Tuyên bố Helsinki (1964 và các sửa đổi) và Quy chế thực hành lâm sàng tốt (GCP).</w:t>
       </w:r>
     </w:p>
     <w:p>
@@ -594,7 +558,7 @@
         <w:rPr>
           <w:sz w:val="24"/>
         </w:rPr>
-        <w:t>Nơi nhận: NCS [Họ và tên Chủ nhiệm đề tài/Nghiên cứu sinh]; Người hướng dẫn; Khoa Tâm lý Giáo dục; Phòng Khoa học Công nghệ; Lưu Văn thư - HĐ Đạo đức.</w:t>
+        <w:t>Nơi nhận: Chủ nhiệm đề tài/NCS; Người hướng dẫn; [Đơn vị quản lý chuyên môn của NCS]; [Phòng/Ban Quản lý Khoa học Công nghệ]; Lưu Văn thư - HĐ Đạo đức.</w:t>
       </w:r>
     </w:p>
     <w:p>
@@ -677,7 +641,7 @@
           <w:color w:val="808080"/>
           <w:sz w:val="20"/>
         </w:rPr>
-        <w:t>Đây là BẢN MẪU để các cơ sở nghiên cứu tham khảo. Các trường có dấu [...] cần được điền theo thông tin thực tế của đề tài cụ thể. Mẫu này được tổng hợp dựa trên Thông tư 43/2024/TT-BYT (hiệu lực 01/02/2025) và tham khảo cấu trúc QĐ từ ĐH Y Hà Nội + BV Nguyễn Tri Phương.</w:t>
+        <w:t>Đây là BẢN MẪU để các cơ sở nghiên cứu tham khảo. Các trường có dấu [...] cần được điền theo thông tin thực tế của đề tài cụ thể. Mẫu này được tổng hợp dựa trên Thông tư 43/2024/TT-BYT (hiệu lực 01/02/2025) và tham khảo cấu trúc QĐ từ ĐH Y Hà Nội + BV Nguyễn Tri Phương. Lưu ý: Thông tư 43/2024 chính thức áp dụng cho nghiên cứu y sinh học do Bộ Y tế quản lý; đối với nghiên cứu khoa học giáo dục/tâm lý học do Bộ Giáo dục và Đào tạo quản lý, các cơ sở có thể áp dụng theo loại suy hoặc theo Quy chế nội bộ riêng của trường — NCS cần xác minh với Phòng Khoa học Công nghệ của trường mình.</w:t>
       </w:r>
     </w:p>
     <w:sectPr>

</xml_diff>

<commit_message>
Polish van phong tu nhien hon 2 ban MauQD: Dieu 1 (phe duyet + dat yeu cau khoa hoc + dao duc thay vi cau dai khang dong), Muc tieu (Xay dung va kiem chung + den ba loai thay vi doi voi ba phan loai), Pham vi cong bo (cau truc 'Ba bai bao gom:' ro rang), Dieu 3 Bao cao (thay 'thong bao' bang 'bao cao kip thoi'), Dieu 4 (bo 'Hieu luc quyet dinh:' thua dau)
</commit_message>
<xml_diff>
--- a/bai-bao-Q1/MauQD_HoiDongDaoDuc_BANMAU_08062026.docx
+++ b/bai-bao-Q1/MauQD_HoiDongDaoDuc_BANMAU_08062026.docx
@@ -280,7 +280,7 @@
         <w:rPr>
           <w:sz w:val="24"/>
         </w:rPr>
-        <w:t>Phê duyệt đề cương nghiên cứu có tiêu đề [Tên đầy đủ của đề tài/dự án nghiên cứu] của nghiên cứu sinh [Họ và tên Chủ nhiệm đề tài/Nghiên cứu sinh] ([Đơn vị công tác/học tập]), dưới sự hướng dẫn của [Họ tên + học hàm/học vị của Người hướng dẫn], về mặt khoa học và đạo đức trong nghiên cứu.</w:t>
+        <w:t>Phê duyệt đề cương nghiên cứu [Tên đầy đủ của đề tài/dự án nghiên cứu] của nghiên cứu sinh [Họ và tên Chủ nhiệm đề tài/Nghiên cứu sinh] ([Đơn vị công tác/học tập]), do [Họ tên + học hàm/học vị của Người hướng dẫn] hướng dẫn khoa học. Đề cương đạt yêu cầu về tính khoa học và tuân thủ các nguyên tắc đạo đức trong nghiên cứu.</w:t>
       </w:r>
     </w:p>
     <w:p>
@@ -492,7 +492,7 @@
         <w:rPr>
           <w:sz w:val="24"/>
         </w:rPr>
-        <w:t>• Thông báo kịp thời cho Hội đồng Đạo đức bất kỳ sự kiện bất lợi nào hoặc thay đổi đối với đề cương đã được phê duyệt;</w:t>
+        <w:t>• Báo cáo kịp thời cho Hội đồng Đạo đức mọi sự kiện bất lợi xảy ra trong quá trình triển khai, cũng như mọi thay đổi so với đề cương đã được phê duyệt;</w:t>
       </w:r>
     </w:p>
     <w:p>
@@ -505,7 +505,7 @@
         <w:rPr>
           <w:sz w:val="24"/>
         </w:rPr>
-        <w:t>• Lưu trữ hồ sơ nghiên cứu trong thời hạn tối thiểu 05 năm kể từ ngày hoàn thành nghiên cứu;</w:t>
+        <w:t>• Lưu trữ hồ sơ nghiên cứu tối thiểu 05 năm kể từ ngày hoàn thành nghiên cứu;</w:t>
       </w:r>
     </w:p>
     <w:p>
@@ -538,7 +538,7 @@
         <w:rPr>
           <w:sz w:val="24"/>
         </w:rPr>
-        <w:t>Hiệu lực quyết định: Quyết định này có hiệu lực kể từ ngày ký. Phạm vi phê duyệt áp dụng cho toàn bộ thời gian triển khai nghiên cứu nêu tại Điều 2 và bao trùm tất cả các công bố khoa học phát sinh từ đề tài này.</w:t>
+        <w:t>Quyết định này có hiệu lực kể từ ngày ký. Phạm vi phê duyệt áp dụng trong toàn bộ thời gian triển khai nghiên cứu nêu tại Điều 2, đồng thời bao trùm mọi công bố khoa học phát sinh từ đề tài này.</w:t>
       </w:r>
     </w:p>
     <w:p>

</xml_diff>

<commit_message>
MauQD: in-place tô đỏ + đậm các placeholder cần điền ([...], XXX, ___) trong cả 2 bản BANMAU và DIENSAN; KHÔNG đụng script .py (chỉ in-place 2 docx)
</commit_message>
<xml_diff>
--- a/bai-bao-Q1/MauQD_HoiDongDaoDuc_BANMAU_08062026.docx
+++ b/bai-bao-Q1/MauQD_HoiDongDaoDuc_BANMAU_08062026.docx
@@ -26,6 +26,7 @@
               <w:rPr>
                 <w:rFonts w:ascii="Times New Roman" w:hAnsi="Times New Roman"/>
                 <w:b/>
+                <w:color w:val="C00000"/>
                 <w:sz w:val="22"/>
               </w:rPr>
               <w:t>[TÊN BỘ/NGÀNH CHỦ QUẢN]</w:t>
@@ -40,6 +41,7 @@
               <w:rPr>
                 <w:rFonts w:ascii="Times New Roman" w:hAnsi="Times New Roman"/>
                 <w:b/>
+                <w:color w:val="C00000"/>
                 <w:sz w:val="22"/>
               </w:rPr>
               <w:t>[TÊN TRƯỜNG/VIỆN]</w:t>
@@ -65,6 +67,7 @@
               <w:rPr>
                 <w:rFonts w:ascii="Times New Roman" w:hAnsi="Times New Roman"/>
                 <w:b/>
+                <w:color w:val="C00000"/>
                 <w:sz w:val="22"/>
               </w:rPr>
               <w:t>[Tên Hội đồng Đạo đức]</w:t>
@@ -76,10 +79,20 @@
             </w:pPr>
             <w:r>
               <w:rPr>
+                <w:rFonts w:ascii="Times New Roman" w:hAnsi="Times New Roman"/>
                 <w:b/>
                 <w:sz w:val="22"/>
               </w:rPr>
-              <w:t>Số: [___/QĐ-…]</w:t>
+              <w:t xml:space="preserve">Số: </w:t>
+            </w:r>
+            <w:r>
+              <w:rPr>
+                <w:rFonts w:ascii="Times New Roman" w:hAnsi="Times New Roman"/>
+                <w:b/>
+                <w:color w:val="C00000"/>
+                <w:sz w:val="22"/>
+              </w:rPr>
+              <w:t>[___/QĐ-…]</w:t>
             </w:r>
           </w:p>
         </w:tc>
@@ -132,10 +145,67 @@
             </w:pPr>
             <w:r>
               <w:rPr>
+                <w:rFonts w:ascii="Times New Roman" w:hAnsi="Times New Roman"/>
+                <w:b/>
+                <w:i/>
+                <w:color w:val="C00000"/>
+                <w:sz w:val="22"/>
+              </w:rPr>
+              <w:t>[Địa điểm]</w:t>
+            </w:r>
+            <w:r>
+              <w:rPr>
+                <w:rFonts w:ascii="Times New Roman" w:hAnsi="Times New Roman"/>
                 <w:i/>
                 <w:sz w:val="22"/>
               </w:rPr>
-              <w:t>[Địa điểm], ngày [ngày] tháng [tháng] năm [năm]</w:t>
+              <w:t xml:space="preserve">, ngày </w:t>
+            </w:r>
+            <w:r>
+              <w:rPr>
+                <w:rFonts w:ascii="Times New Roman" w:hAnsi="Times New Roman"/>
+                <w:b/>
+                <w:i/>
+                <w:color w:val="C00000"/>
+                <w:sz w:val="22"/>
+              </w:rPr>
+              <w:t>[ngày]</w:t>
+            </w:r>
+            <w:r>
+              <w:rPr>
+                <w:rFonts w:ascii="Times New Roman" w:hAnsi="Times New Roman"/>
+                <w:i/>
+                <w:sz w:val="22"/>
+              </w:rPr>
+              <w:t xml:space="preserve"> tháng </w:t>
+            </w:r>
+            <w:r>
+              <w:rPr>
+                <w:rFonts w:ascii="Times New Roman" w:hAnsi="Times New Roman"/>
+                <w:b/>
+                <w:i/>
+                <w:color w:val="C00000"/>
+                <w:sz w:val="22"/>
+              </w:rPr>
+              <w:t>[tháng]</w:t>
+            </w:r>
+            <w:r>
+              <w:rPr>
+                <w:rFonts w:ascii="Times New Roman" w:hAnsi="Times New Roman"/>
+                <w:i/>
+                <w:sz w:val="22"/>
+              </w:rPr>
+              <w:t xml:space="preserve"> năm </w:t>
+            </w:r>
+            <w:r>
+              <w:rPr>
+                <w:rFonts w:ascii="Times New Roman" w:hAnsi="Times New Roman"/>
+                <w:b/>
+                <w:i/>
+                <w:color w:val="C00000"/>
+                <w:sz w:val="22"/>
+              </w:rPr>
+              <w:t>[năm]</w:t>
             </w:r>
           </w:p>
         </w:tc>
@@ -174,10 +244,20 @@
       </w:pPr>
       <w:r>
         <w:rPr>
+          <w:rFonts w:ascii="Times New Roman" w:hAnsi="Times New Roman"/>
           <w:b/>
           <w:sz w:val="26"/>
         </w:rPr>
-        <w:t>CHỦ TỊCH [TÊN HỘI ĐỒNG ĐẠO ĐỨC]</w:t>
+        <w:t xml:space="preserve">CHỦ TỊCH </w:t>
+      </w:r>
+      <w:r>
+        <w:rPr>
+          <w:rFonts w:ascii="Times New Roman" w:hAnsi="Times New Roman"/>
+          <w:b/>
+          <w:color w:val="C00000"/>
+          <w:sz w:val="26"/>
+        </w:rPr>
+        <w:t>[TÊN HỘI ĐỒNG ĐẠO ĐỨC]</w:t>
       </w:r>
     </w:p>
     <w:p>
@@ -202,10 +282,83 @@
       </w:pPr>
       <w:r>
         <w:rPr>
+          <w:rFonts w:ascii="Times New Roman" w:hAnsi="Times New Roman"/>
           <w:i/>
           <w:sz w:val="24"/>
         </w:rPr>
-        <w:t>Căn cứ Quyết định số [số QĐ thành lập HĐ Đạo đức] ngày [ngày] của Hiệu trưởng [TÊN TRƯỜNG/VIỆN] về việc thành lập [Tên Hội đồng Đạo đức];</w:t>
+        <w:t xml:space="preserve">Căn cứ Quyết định số </w:t>
+      </w:r>
+      <w:r>
+        <w:rPr>
+          <w:rFonts w:ascii="Times New Roman" w:hAnsi="Times New Roman"/>
+          <w:b/>
+          <w:i/>
+          <w:color w:val="C00000"/>
+          <w:sz w:val="24"/>
+        </w:rPr>
+        <w:t>[số QĐ thành lập HĐ Đạo đức]</w:t>
+      </w:r>
+      <w:r>
+        <w:rPr>
+          <w:rFonts w:ascii="Times New Roman" w:hAnsi="Times New Roman"/>
+          <w:i/>
+          <w:sz w:val="24"/>
+        </w:rPr>
+        <w:t xml:space="preserve"> ngày </w:t>
+      </w:r>
+      <w:r>
+        <w:rPr>
+          <w:rFonts w:ascii="Times New Roman" w:hAnsi="Times New Roman"/>
+          <w:b/>
+          <w:i/>
+          <w:color w:val="C00000"/>
+          <w:sz w:val="24"/>
+        </w:rPr>
+        <w:t>[ngày]</w:t>
+      </w:r>
+      <w:r>
+        <w:rPr>
+          <w:rFonts w:ascii="Times New Roman" w:hAnsi="Times New Roman"/>
+          <w:i/>
+          <w:sz w:val="24"/>
+        </w:rPr>
+        <w:t xml:space="preserve"> của Hiệu trưởng </w:t>
+      </w:r>
+      <w:r>
+        <w:rPr>
+          <w:rFonts w:ascii="Times New Roman" w:hAnsi="Times New Roman"/>
+          <w:b/>
+          <w:i/>
+          <w:color w:val="C00000"/>
+          <w:sz w:val="24"/>
+        </w:rPr>
+        <w:t>[TÊN TRƯỜNG/VIỆN]</w:t>
+      </w:r>
+      <w:r>
+        <w:rPr>
+          <w:rFonts w:ascii="Times New Roman" w:hAnsi="Times New Roman"/>
+          <w:i/>
+          <w:sz w:val="24"/>
+        </w:rPr>
+        <w:t xml:space="preserve"> về việc thành lập </w:t>
+      </w:r>
+      <w:r>
+        <w:rPr>
+          <w:rFonts w:ascii="Times New Roman" w:hAnsi="Times New Roman"/>
+          <w:b/>
+          <w:i/>
+          <w:color w:val="C00000"/>
+          <w:sz w:val="24"/>
+        </w:rPr>
+        <w:t>[Tên Hội đồng Đạo đức]</w:t>
+      </w:r>
+      <w:r>
+        <w:rPr>
+          <w:rFonts w:ascii="Times New Roman" w:hAnsi="Times New Roman"/>
+          <w:i/>
+          <w:sz w:val="24"/>
+        </w:rPr>
+        <w:t>;</w:t>
       </w:r>
     </w:p>
     <w:p>
@@ -216,10 +369,29 @@
       </w:pPr>
       <w:r>
         <w:rPr>
+          <w:rFonts w:ascii="Times New Roman" w:hAnsi="Times New Roman"/>
           <w:i/>
           <w:sz w:val="24"/>
         </w:rPr>
-        <w:t>Căn cứ Hồ sơ xin phê duyệt đạo đức đề tài nghiên cứu của [Họ và tên Chủ nhiệm đề tài/Nghiên cứu sinh] đề ngày … tháng … năm …;</w:t>
+        <w:t xml:space="preserve">Căn cứ Hồ sơ xin phê duyệt đạo đức đề tài nghiên cứu của </w:t>
+      </w:r>
+      <w:r>
+        <w:rPr>
+          <w:rFonts w:ascii="Times New Roman" w:hAnsi="Times New Roman"/>
+          <w:b/>
+          <w:i/>
+          <w:color w:val="C00000"/>
+          <w:sz w:val="24"/>
+        </w:rPr>
+        <w:t>[Họ và tên Chủ nhiệm đề tài/Nghiên cứu sinh]</w:t>
+      </w:r>
+      <w:r>
+        <w:rPr>
+          <w:rFonts w:ascii="Times New Roman" w:hAnsi="Times New Roman"/>
+          <w:i/>
+          <w:sz w:val="24"/>
+        </w:rPr>
+        <w:t xml:space="preserve"> đề ngày … tháng … năm …;</w:t>
       </w:r>
     </w:p>
     <w:p>
@@ -230,10 +402,65 @@
       </w:pPr>
       <w:r>
         <w:rPr>
+          <w:rFonts w:ascii="Times New Roman" w:hAnsi="Times New Roman"/>
           <w:i/>
           <w:sz w:val="24"/>
         </w:rPr>
-        <w:t>Căn cứ kết luận của Hội đồng Đạo đức tại Phiên họp thẩm định ngày [ngày]/[tháng]/[năm];</w:t>
+        <w:t xml:space="preserve">Căn cứ kết luận của Hội đồng Đạo đức tại Phiên họp thẩm định ngày </w:t>
+      </w:r>
+      <w:r>
+        <w:rPr>
+          <w:rFonts w:ascii="Times New Roman" w:hAnsi="Times New Roman"/>
+          <w:b/>
+          <w:i/>
+          <w:color w:val="C00000"/>
+          <w:sz w:val="24"/>
+        </w:rPr>
+        <w:t>[ngày]</w:t>
+      </w:r>
+      <w:r>
+        <w:rPr>
+          <w:rFonts w:ascii="Times New Roman" w:hAnsi="Times New Roman"/>
+          <w:i/>
+          <w:sz w:val="24"/>
+        </w:rPr>
+        <w:t>/</w:t>
+      </w:r>
+      <w:r>
+        <w:rPr>
+          <w:rFonts w:ascii="Times New Roman" w:hAnsi="Times New Roman"/>
+          <w:b/>
+          <w:i/>
+          <w:color w:val="C00000"/>
+          <w:sz w:val="24"/>
+        </w:rPr>
+        <w:t>[tháng]</w:t>
+      </w:r>
+      <w:r>
+        <w:rPr>
+          <w:rFonts w:ascii="Times New Roman" w:hAnsi="Times New Roman"/>
+          <w:i/>
+          <w:sz w:val="24"/>
+        </w:rPr>
+        <w:t>/</w:t>
+      </w:r>
+      <w:r>
+        <w:rPr>
+          <w:rFonts w:ascii="Times New Roman" w:hAnsi="Times New Roman"/>
+          <w:b/>
+          <w:i/>
+          <w:color w:val="C00000"/>
+          <w:sz w:val="24"/>
+        </w:rPr>
+        <w:t>[năm]</w:t>
+      </w:r>
+      <w:r>
+        <w:rPr>
+          <w:rFonts w:ascii="Times New Roman" w:hAnsi="Times New Roman"/>
+          <w:i/>
+          <w:sz w:val="24"/>
+        </w:rPr>
+        <w:t>;</w:t>
       </w:r>
     </w:p>
     <w:p>
@@ -271,16 +498,79 @@
       </w:pPr>
       <w:r>
         <w:rPr>
+          <w:rFonts w:ascii="Times New Roman" w:hAnsi="Times New Roman"/>
           <w:b/>
           <w:sz w:val="24"/>
         </w:rPr>
-        <w:t xml:space="preserve">Điều 1. </w:t>
+        <w:t xml:space="preserve">Điều 1. Phê duyệt đề cương nghiên cứu </w:t>
       </w:r>
       <w:r>
         <w:rPr>
+          <w:rFonts w:ascii="Times New Roman" w:hAnsi="Times New Roman"/>
+          <w:b/>
+          <w:color w:val="C00000"/>
           <w:sz w:val="24"/>
         </w:rPr>
-        <w:t>Phê duyệt đề cương nghiên cứu [Tên đầy đủ của đề tài/dự án nghiên cứu] của nghiên cứu sinh [Họ và tên Chủ nhiệm đề tài/Nghiên cứu sinh] ([Đơn vị công tác/học tập]), do [Họ tên + học hàm/học vị của Người hướng dẫn] hướng dẫn khoa học. Đề cương đạt yêu cầu về tính khoa học và tuân thủ các nguyên tắc đạo đức trong nghiên cứu.</w:t>
+        <w:t>[Tên đầy đủ của đề tài/dự án nghiên cứu]</w:t>
+      </w:r>
+      <w:r>
+        <w:rPr>
+          <w:rFonts w:ascii="Times New Roman" w:hAnsi="Times New Roman"/>
+          <w:b/>
+          <w:sz w:val="24"/>
+        </w:rPr>
+        <w:t xml:space="preserve"> của nghiên cứu sinh </w:t>
+      </w:r>
+      <w:r>
+        <w:rPr>
+          <w:rFonts w:ascii="Times New Roman" w:hAnsi="Times New Roman"/>
+          <w:b/>
+          <w:color w:val="C00000"/>
+          <w:sz w:val="24"/>
+        </w:rPr>
+        <w:t>[Họ và tên Chủ nhiệm đề tài/Nghiên cứu sinh]</w:t>
+      </w:r>
+      <w:r>
+        <w:rPr>
+          <w:rFonts w:ascii="Times New Roman" w:hAnsi="Times New Roman"/>
+          <w:b/>
+          <w:sz w:val="24"/>
+        </w:rPr>
+        <w:t xml:space="preserve"> (</w:t>
+      </w:r>
+      <w:r>
+        <w:rPr>
+          <w:rFonts w:ascii="Times New Roman" w:hAnsi="Times New Roman"/>
+          <w:b/>
+          <w:color w:val="C00000"/>
+          <w:sz w:val="24"/>
+        </w:rPr>
+        <w:t>[Đơn vị công tác/học tập]</w:t>
+      </w:r>
+      <w:r>
+        <w:rPr>
+          <w:rFonts w:ascii="Times New Roman" w:hAnsi="Times New Roman"/>
+          <w:b/>
+          <w:sz w:val="24"/>
+        </w:rPr>
+        <w:t xml:space="preserve">), do </w:t>
+      </w:r>
+      <w:r>
+        <w:rPr>
+          <w:rFonts w:ascii="Times New Roman" w:hAnsi="Times New Roman"/>
+          <w:b/>
+          <w:color w:val="C00000"/>
+          <w:sz w:val="24"/>
+        </w:rPr>
+        <w:t>[Họ tên + học hàm/học vị của Người hướng dẫn]</w:t>
+      </w:r>
+      <w:r>
+        <w:rPr>
+          <w:rFonts w:ascii="Times New Roman" w:hAnsi="Times New Roman"/>
+          <w:b/>
+          <w:sz w:val="24"/>
+        </w:rPr>
+        <w:t xml:space="preserve"> hướng dẫn khoa học. Đề cương đạt yêu cầu về tính khoa học và tuân thủ các nguyên tắc đạo đức trong nghiên cứu.</w:t>
       </w:r>
     </w:p>
     <w:p>
@@ -311,6 +601,7 @@
       </w:pPr>
       <w:r>
         <w:rPr>
+          <w:rFonts w:ascii="Times New Roman" w:hAnsi="Times New Roman"/>
           <w:b/>
           <w:sz w:val="24"/>
         </w:rPr>
@@ -318,6 +609,9 @@
       </w:r>
       <w:r>
         <w:rPr>
+          <w:rFonts w:ascii="Times New Roman" w:hAnsi="Times New Roman"/>
+          <w:b/>
+          <w:color w:val="C00000"/>
           <w:sz w:val="24"/>
         </w:rPr>
         <w:t>[Mục tiêu nghiên cứu — tóm tắt 2-3 câu]</w:t>
@@ -331,6 +625,7 @@
       </w:pPr>
       <w:r>
         <w:rPr>
+          <w:rFonts w:ascii="Times New Roman" w:hAnsi="Times New Roman"/>
           <w:b/>
           <w:sz w:val="24"/>
         </w:rPr>
@@ -338,6 +633,9 @@
       </w:r>
       <w:r>
         <w:rPr>
+          <w:rFonts w:ascii="Times New Roman" w:hAnsi="Times New Roman"/>
+          <w:b/>
+          <w:color w:val="C00000"/>
           <w:sz w:val="24"/>
         </w:rPr>
         <w:t>[Đối tượng nghiên cứu]</w:t>
@@ -351,6 +649,7 @@
       </w:pPr>
       <w:r>
         <w:rPr>
+          <w:rFonts w:ascii="Times New Roman" w:hAnsi="Times New Roman"/>
           <w:b/>
           <w:sz w:val="24"/>
         </w:rPr>
@@ -358,6 +657,9 @@
       </w:r>
       <w:r>
         <w:rPr>
+          <w:rFonts w:ascii="Times New Roman" w:hAnsi="Times New Roman"/>
+          <w:b/>
+          <w:color w:val="C00000"/>
           <w:sz w:val="24"/>
         </w:rPr>
         <w:t>[Cỡ mẫu dự kiến]</w:t>
@@ -371,6 +673,7 @@
       </w:pPr>
       <w:r>
         <w:rPr>
+          <w:rFonts w:ascii="Times New Roman" w:hAnsi="Times New Roman"/>
           <w:b/>
           <w:sz w:val="24"/>
         </w:rPr>
@@ -378,6 +681,9 @@
       </w:r>
       <w:r>
         <w:rPr>
+          <w:rFonts w:ascii="Times New Roman" w:hAnsi="Times New Roman"/>
+          <w:b/>
+          <w:color w:val="C00000"/>
           <w:sz w:val="24"/>
         </w:rPr>
         <w:t>[Địa bàn nghiên cứu]</w:t>
@@ -391,16 +697,37 @@
       </w:pPr>
       <w:r>
         <w:rPr>
+          <w:rFonts w:ascii="Times New Roman" w:hAnsi="Times New Roman"/>
           <w:b/>
           <w:sz w:val="24"/>
         </w:rPr>
-        <w:t xml:space="preserve">• Thời gian triển khai: </w:t>
+        <w:t xml:space="preserve">• Thời gian triển khai: từ </w:t>
       </w:r>
       <w:r>
         <w:rPr>
+          <w:rFonts w:ascii="Times New Roman" w:hAnsi="Times New Roman"/>
+          <w:b/>
+          <w:color w:val="C00000"/>
           <w:sz w:val="24"/>
         </w:rPr>
-        <w:t>từ [tháng/năm bắt đầu] đến [tháng/năm kết thúc]</w:t>
+        <w:t>[tháng/năm bắt đầu]</w:t>
+      </w:r>
+      <w:r>
+        <w:rPr>
+          <w:rFonts w:ascii="Times New Roman" w:hAnsi="Times New Roman"/>
+          <w:b/>
+          <w:sz w:val="24"/>
+        </w:rPr>
+        <w:t xml:space="preserve"> đến </w:t>
+      </w:r>
+      <w:r>
+        <w:rPr>
+          <w:rFonts w:ascii="Times New Roman" w:hAnsi="Times New Roman"/>
+          <w:b/>
+          <w:color w:val="C00000"/>
+          <w:sz w:val="24"/>
+        </w:rPr>
+        <w:t>[tháng/năm kết thúc]</w:t>
       </w:r>
     </w:p>
     <w:p>
@@ -411,6 +738,7 @@
       </w:pPr>
       <w:r>
         <w:rPr>
+          <w:rFonts w:ascii="Times New Roman" w:hAnsi="Times New Roman"/>
           <w:b/>
           <w:sz w:val="24"/>
         </w:rPr>
@@ -418,6 +746,9 @@
       </w:r>
       <w:r>
         <w:rPr>
+          <w:rFonts w:ascii="Times New Roman" w:hAnsi="Times New Roman"/>
+          <w:b/>
+          <w:color w:val="C00000"/>
           <w:sz w:val="24"/>
         </w:rPr>
         <w:t>[Mô tả phạm vi công bố: luận án + các bài báo dự kiến công bố trên tạp chí trong nước/quốc tế]</w:t>
@@ -549,16 +880,45 @@
       </w:pPr>
       <w:r>
         <w:rPr>
+          <w:rFonts w:ascii="Times New Roman" w:hAnsi="Times New Roman"/>
           <w:b/>
           <w:sz w:val="24"/>
         </w:rPr>
-        <w:t xml:space="preserve">Điều 5. </w:t>
+        <w:t xml:space="preserve">Điều 5. Nơi nhận: Chủ nhiệm đề tài/NCS; Người hướng dẫn; </w:t>
       </w:r>
       <w:r>
         <w:rPr>
+          <w:rFonts w:ascii="Times New Roman" w:hAnsi="Times New Roman"/>
+          <w:b/>
+          <w:color w:val="C00000"/>
           <w:sz w:val="24"/>
         </w:rPr>
-        <w:t>Nơi nhận: Chủ nhiệm đề tài/NCS; Người hướng dẫn; [Đơn vị quản lý chuyên môn của NCS]; [Phòng/Ban Quản lý Khoa học Công nghệ]; Lưu Văn thư - HĐ Đạo đức.</w:t>
+        <w:t>[Đơn vị quản lý chuyên môn của NCS]</w:t>
+      </w:r>
+      <w:r>
+        <w:rPr>
+          <w:rFonts w:ascii="Times New Roman" w:hAnsi="Times New Roman"/>
+          <w:b/>
+          <w:sz w:val="24"/>
+        </w:rPr>
+        <w:t xml:space="preserve">; </w:t>
+      </w:r>
+      <w:r>
+        <w:rPr>
+          <w:rFonts w:ascii="Times New Roman" w:hAnsi="Times New Roman"/>
+          <w:b/>
+          <w:color w:val="C00000"/>
+          <w:sz w:val="24"/>
+        </w:rPr>
+        <w:t>[Phòng/Ban Quản lý Khoa học Công nghệ]</w:t>
+      </w:r>
+      <w:r>
+        <w:rPr>
+          <w:rFonts w:ascii="Times New Roman" w:hAnsi="Times New Roman"/>
+          <w:b/>
+          <w:sz w:val="24"/>
+        </w:rPr>
+        <w:t>; Lưu Văn thư - HĐ Đạo đức.</w:t>
       </w:r>
     </w:p>
     <w:p>
@@ -616,7 +976,9 @@
       </w:pPr>
       <w:r>
         <w:rPr>
+          <w:rFonts w:ascii="Times New Roman" w:hAnsi="Times New Roman"/>
           <w:b/>
+          <w:color w:val="C00000"/>
           <w:sz w:val="24"/>
         </w:rPr>
         <w:t>[Họ tên + học hàm/học vị Chủ tịch HĐ Đạo đức]</w:t>
@@ -628,20 +990,31 @@
       </w:pPr>
       <w:r>
         <w:rPr>
+          <w:rFonts w:ascii="Times New Roman" w:hAnsi="Times New Roman"/>
           <w:b/>
           <w:i/>
-          <w:color w:val="808080"/>
           <w:sz w:val="20"/>
         </w:rPr>
-        <w:t xml:space="preserve">Ghi chú: </w:t>
+        <w:t xml:space="preserve">Ghi chú: Đây là BẢN MẪU để các cơ sở nghiên cứu tham khảo. Các trường có dấu </w:t>
       </w:r>
       <w:r>
         <w:rPr>
+          <w:rFonts w:ascii="Times New Roman" w:hAnsi="Times New Roman"/>
+          <w:b/>
           <w:i/>
-          <w:color w:val="808080"/>
+          <w:color w:val="C00000"/>
           <w:sz w:val="20"/>
         </w:rPr>
-        <w:t>Đây là BẢN MẪU để các cơ sở nghiên cứu tham khảo. Các trường có dấu [...] cần được điền theo thông tin thực tế của đề tài cụ thể. Mẫu này được tổng hợp dựa trên Thông tư 43/2024/TT-BYT (hiệu lực 01/02/2025) và tham khảo cấu trúc QĐ từ ĐH Y Hà Nội + BV Nguyễn Tri Phương. Lưu ý: Thông tư 43/2024 chính thức áp dụng cho nghiên cứu y sinh học do Bộ Y tế quản lý; đối với nghiên cứu khoa học giáo dục/tâm lý học do Bộ Giáo dục và Đào tạo quản lý, các cơ sở có thể áp dụng theo loại suy hoặc theo Quy chế nội bộ riêng của trường — NCS cần xác minh với Phòng Khoa học Công nghệ của trường mình.</w:t>
+        <w:t>[...]</w:t>
+      </w:r>
+      <w:r>
+        <w:rPr>
+          <w:rFonts w:ascii="Times New Roman" w:hAnsi="Times New Roman"/>
+          <w:b/>
+          <w:i/>
+          <w:sz w:val="20"/>
+        </w:rPr>
+        <w:t xml:space="preserve"> cần được điền theo thông tin thực tế của đề tài cụ thể. Mẫu này được tổng hợp dựa trên Thông tư 43/2024/TT-BYT (hiệu lực 01/02/2025) và tham khảo cấu trúc QĐ từ ĐH Y Hà Nội + BV Nguyễn Tri Phương. Lưu ý: Thông tư 43/2024 chính thức áp dụng cho nghiên cứu y sinh học do Bộ Y tế quản lý; đối với nghiên cứu khoa học giáo dục/tâm lý học do Bộ Giáo dục và Đào tạo quản lý, các cơ sở có thể áp dụng theo loại suy hoặc theo Quy chế nội bộ riêng của trường — NCS cần xác minh với Phòng Khoa học Công nghệ của trường mình.</w:t>
       </w:r>
     </w:p>
     <w:sectPr>

</xml_diff>

<commit_message>
MauQD 2 ban: in-place xoa 'Ghi chu' footer (watermark noi bo) + re-strip metadata core+app cho ca BANMAU va DIENSAN; chuan tac chinh thuc
</commit_message>
<xml_diff>
--- a/bai-bao-Q1/MauQD_HoiDongDaoDuc_BANMAU_08062026.docx
+++ b/bai-bao-Q1/MauQD_HoiDongDaoDuc_BANMAU_08062026.docx
@@ -984,39 +984,6 @@
         <w:t>[Họ tên + học hàm/học vị Chủ tịch HĐ Đạo đức]</w:t>
       </w:r>
     </w:p>
-    <w:p>
-      <w:pPr>
-        <w:spacing w:before="480"/>
-      </w:pPr>
-      <w:r>
-        <w:rPr>
-          <w:rFonts w:ascii="Times New Roman" w:hAnsi="Times New Roman"/>
-          <w:b/>
-          <w:i/>
-          <w:sz w:val="20"/>
-        </w:rPr>
-        <w:t xml:space="preserve">Ghi chú: Đây là BẢN MẪU để các cơ sở nghiên cứu tham khảo. Các trường có dấu </w:t>
-      </w:r>
-      <w:r>
-        <w:rPr>
-          <w:rFonts w:ascii="Times New Roman" w:hAnsi="Times New Roman"/>
-          <w:b/>
-          <w:i/>
-          <w:color w:val="C00000"/>
-          <w:sz w:val="20"/>
-        </w:rPr>
-        <w:t>[...]</w:t>
-      </w:r>
-      <w:r>
-        <w:rPr>
-          <w:rFonts w:ascii="Times New Roman" w:hAnsi="Times New Roman"/>
-          <w:b/>
-          <w:i/>
-          <w:sz w:val="20"/>
-        </w:rPr>
-        <w:t xml:space="preserve"> cần được điền theo thông tin thực tế của đề tài cụ thể. Mẫu này được tổng hợp dựa trên Thông tư 43/2024/TT-BYT (hiệu lực 01/02/2025) và tham khảo cấu trúc QĐ từ ĐH Y Hà Nội + BV Nguyễn Tri Phương. Lưu ý: Thông tư 43/2024 chính thức áp dụng cho nghiên cứu y sinh học do Bộ Y tế quản lý; đối với nghiên cứu khoa học giáo dục/tâm lý học do Bộ Giáo dục và Đào tạo quản lý, các cơ sở có thể áp dụng theo loại suy hoặc theo Quy chế nội bộ riêng của trường — NCS cần xác minh với Phòng Khoa học Công nghệ của trường mình.</w:t>
-      </w:r>
-    </w:p>
     <w:sectPr>
       <w:pgSz w:w="12240" w:h="15840"/>
       <w:pgMar w:top="1134" w:right="1134" w:bottom="1134" w:left="1417" w:header="720" w:footer="720" w:gutter="0"/>

</xml_diff>

<commit_message>
MauQD 3 fix: (1) Dien san: PGS.TS. Dao Minh Duc (Vien pho Vien TLH Lam sang) thay vi placeholder NMD - thay DMD la huong dan chinh; (2) Fix bold issue: Dieu 1 chi label 'Dieu X.' bold, phan noi dung KHONG bold (chuyen sang color_placeholders_v2 run-by-run); (3) DIENSAN compact 2 trang: margin 1.7cm + line 1.3 + font 11pt; strip Ghi chu + metadata; BAN MAU giu nguyen 2.0cm/1.5/13pt
</commit_message>
<xml_diff>
--- a/bai-bao-Q1/MauQD_HoiDongDaoDuc_BANMAU_08062026.docx
+++ b/bai-bao-Q1/MauQD_HoiDongDaoDuc_BANMAU_08062026.docx
@@ -15,7 +15,7 @@
       <w:tr>
         <w:tc>
           <w:tcPr>
-            <w:tcW w:type="dxa" w:w="4844"/>
+            <w:tcW w:type="dxa" w:w="5071"/>
           </w:tcPr>
           <w:p>
             <w:pPr>
@@ -53,6 +53,7 @@
             </w:pPr>
             <w:r>
               <w:rPr>
+                <w:rFonts w:ascii="Times New Roman" w:hAnsi="Times New Roman"/>
                 <w:sz w:val="22"/>
               </w:rPr>
               <w:t>—————</w:t>
@@ -98,7 +99,7 @@
         </w:tc>
         <w:tc>
           <w:tcPr>
-            <w:tcW w:type="dxa" w:w="4844"/>
+            <w:tcW w:type="dxa" w:w="5071"/>
           </w:tcPr>
           <w:p>
             <w:pPr>
@@ -134,6 +135,7 @@
             </w:pPr>
             <w:r>
               <w:rPr>
+                <w:rFonts w:ascii="Times New Roman" w:hAnsi="Times New Roman"/>
                 <w:sz w:val="22"/>
               </w:rPr>
               <w:t>—————</w:t>
@@ -218,6 +220,7 @@
       </w:pPr>
       <w:r>
         <w:rPr>
+          <w:rFonts w:ascii="Times New Roman" w:hAnsi="Times New Roman"/>
           <w:b/>
           <w:sz w:val="30"/>
         </w:rPr>
@@ -231,6 +234,7 @@
       </w:pPr>
       <w:r>
         <w:rPr>
+          <w:rFonts w:ascii="Times New Roman" w:hAnsi="Times New Roman"/>
           <w:i/>
           <w:sz w:val="24"/>
         </w:rPr>
@@ -268,6 +272,7 @@
       </w:pPr>
       <w:r>
         <w:rPr>
+          <w:rFonts w:ascii="Times New Roman" w:hAnsi="Times New Roman"/>
           <w:i/>
           <w:sz w:val="24"/>
         </w:rPr>
@@ -471,6 +476,7 @@
       </w:pPr>
       <w:r>
         <w:rPr>
+          <w:rFonts w:ascii="Times New Roman" w:hAnsi="Times New Roman"/>
           <w:i/>
           <w:sz w:val="24"/>
         </w:rPr>
@@ -484,6 +490,7 @@
       </w:pPr>
       <w:r>
         <w:rPr>
+          <w:rFonts w:ascii="Times New Roman" w:hAnsi="Times New Roman"/>
           <w:b/>
           <w:sz w:val="28"/>
         </w:rPr>
@@ -502,7 +509,14 @@
           <w:b/>
           <w:sz w:val="24"/>
         </w:rPr>
-        <w:t xml:space="preserve">Điều 1. Phê duyệt đề cương nghiên cứu </w:t>
+        <w:t xml:space="preserve">Điều 1. </w:t>
+      </w:r>
+      <w:r>
+        <w:rPr>
+          <w:rFonts w:ascii="Times New Roman" w:hAnsi="Times New Roman"/>
+          <w:sz w:val="24"/>
+        </w:rPr>
+        <w:t xml:space="preserve">Phê duyệt đề cương nghiên cứu </w:t>
       </w:r>
       <w:r>
         <w:rPr>
@@ -516,7 +530,6 @@
       <w:r>
         <w:rPr>
           <w:rFonts w:ascii="Times New Roman" w:hAnsi="Times New Roman"/>
-          <w:b/>
           <w:sz w:val="24"/>
         </w:rPr>
         <w:t xml:space="preserve"> của nghiên cứu sinh </w:t>
@@ -533,7 +546,6 @@
       <w:r>
         <w:rPr>
           <w:rFonts w:ascii="Times New Roman" w:hAnsi="Times New Roman"/>
-          <w:b/>
           <w:sz w:val="24"/>
         </w:rPr>
         <w:t xml:space="preserve"> (</w:t>
@@ -550,7 +562,6 @@
       <w:r>
         <w:rPr>
           <w:rFonts w:ascii="Times New Roman" w:hAnsi="Times New Roman"/>
-          <w:b/>
           <w:sz w:val="24"/>
         </w:rPr>
         <w:t xml:space="preserve">), do </w:t>
@@ -567,7 +578,6 @@
       <w:r>
         <w:rPr>
           <w:rFonts w:ascii="Times New Roman" w:hAnsi="Times New Roman"/>
-          <w:b/>
           <w:sz w:val="24"/>
         </w:rPr>
         <w:t xml:space="preserve"> hướng dẫn khoa học. Đề cương đạt yêu cầu về tính khoa học và tuân thủ các nguyên tắc đạo đức trong nghiên cứu.</w:t>
@@ -581,6 +591,7 @@
       </w:pPr>
       <w:r>
         <w:rPr>
+          <w:rFonts w:ascii="Times New Roman" w:hAnsi="Times New Roman"/>
           <w:b/>
           <w:sz w:val="24"/>
         </w:rPr>
@@ -588,6 +599,7 @@
       </w:r>
       <w:r>
         <w:rPr>
+          <w:rFonts w:ascii="Times New Roman" w:hAnsi="Times New Roman"/>
           <w:sz w:val="24"/>
         </w:rPr>
         <w:t>Phạm vi phê duyệt:</w:t>
@@ -701,7 +713,14 @@
           <w:b/>
           <w:sz w:val="24"/>
         </w:rPr>
-        <w:t xml:space="preserve">• Thời gian triển khai: từ </w:t>
+        <w:t xml:space="preserve">• Thời gian triển khai: </w:t>
+      </w:r>
+      <w:r>
+        <w:rPr>
+          <w:rFonts w:ascii="Times New Roman" w:hAnsi="Times New Roman"/>
+          <w:sz w:val="24"/>
+        </w:rPr>
+        <w:t xml:space="preserve">từ </w:t>
       </w:r>
       <w:r>
         <w:rPr>
@@ -715,7 +734,6 @@
       <w:r>
         <w:rPr>
           <w:rFonts w:ascii="Times New Roman" w:hAnsi="Times New Roman"/>
-          <w:b/>
           <w:sz w:val="24"/>
         </w:rPr>
         <w:t xml:space="preserve"> đến </w:t>
@@ -762,6 +780,7 @@
       </w:pPr>
       <w:r>
         <w:rPr>
+          <w:rFonts w:ascii="Times New Roman" w:hAnsi="Times New Roman"/>
           <w:b/>
           <w:sz w:val="24"/>
         </w:rPr>
@@ -769,6 +788,7 @@
       </w:r>
       <w:r>
         <w:rPr>
+          <w:rFonts w:ascii="Times New Roman" w:hAnsi="Times New Roman"/>
           <w:sz w:val="24"/>
         </w:rPr>
         <w:t>Trách nhiệm của Chủ nhiệm đề tài/Nghiên cứu sinh:</w:t>
@@ -782,6 +802,7 @@
       </w:pPr>
       <w:r>
         <w:rPr>
+          <w:rFonts w:ascii="Times New Roman" w:hAnsi="Times New Roman"/>
           <w:sz w:val="24"/>
         </w:rPr>
         <w:t>• Thu thập sự đồng ý bằng văn bản (informed consent) của cha/mẹ/người giám hộ và sự đồng thuận bằng văn bản (assent) của học sinh trước khi tiến hành thu dữ liệu;</w:t>
@@ -795,6 +816,7 @@
       </w:pPr>
       <w:r>
         <w:rPr>
+          <w:rFonts w:ascii="Times New Roman" w:hAnsi="Times New Roman"/>
           <w:sz w:val="24"/>
         </w:rPr>
         <w:t>• Bảo mật thông tin cá nhân của đối tượng nghiên cứu theo quy định hiện hành;</w:t>
@@ -808,6 +830,7 @@
       </w:pPr>
       <w:r>
         <w:rPr>
+          <w:rFonts w:ascii="Times New Roman" w:hAnsi="Times New Roman"/>
           <w:sz w:val="24"/>
         </w:rPr>
         <w:t>• Báo cáo tiến độ thực hiện đề tài hàng năm cho Hội đồng Đạo đức;</w:t>
@@ -821,6 +844,7 @@
       </w:pPr>
       <w:r>
         <w:rPr>
+          <w:rFonts w:ascii="Times New Roman" w:hAnsi="Times New Roman"/>
           <w:sz w:val="24"/>
         </w:rPr>
         <w:t>• Báo cáo kịp thời cho Hội đồng Đạo đức mọi sự kiện bất lợi xảy ra trong quá trình triển khai, cũng như mọi thay đổi so với đề cương đã được phê duyệt;</w:t>
@@ -834,6 +858,7 @@
       </w:pPr>
       <w:r>
         <w:rPr>
+          <w:rFonts w:ascii="Times New Roman" w:hAnsi="Times New Roman"/>
           <w:sz w:val="24"/>
         </w:rPr>
         <w:t>• Lưu trữ hồ sơ nghiên cứu tối thiểu 05 năm kể từ ngày hoàn thành nghiên cứu;</w:t>
@@ -847,6 +872,7 @@
       </w:pPr>
       <w:r>
         <w:rPr>
+          <w:rFonts w:ascii="Times New Roman" w:hAnsi="Times New Roman"/>
           <w:sz w:val="24"/>
         </w:rPr>
         <w:t>• Tuân thủ Tuyên bố Helsinki (1964 và các sửa đổi) và Quy chế thực hành lâm sàng tốt (GCP).</w:t>
@@ -860,6 +886,7 @@
       </w:pPr>
       <w:r>
         <w:rPr>
+          <w:rFonts w:ascii="Times New Roman" w:hAnsi="Times New Roman"/>
           <w:b/>
           <w:sz w:val="24"/>
         </w:rPr>
@@ -867,6 +894,7 @@
       </w:r>
       <w:r>
         <w:rPr>
+          <w:rFonts w:ascii="Times New Roman" w:hAnsi="Times New Roman"/>
           <w:sz w:val="24"/>
         </w:rPr>
         <w:t>Quyết định này có hiệu lực kể từ ngày ký. Phạm vi phê duyệt áp dụng trong toàn bộ thời gian triển khai nghiên cứu nêu tại Điều 2, đồng thời bao trùm mọi công bố khoa học phát sinh từ đề tài này.</w:t>
@@ -884,7 +912,14 @@
           <w:b/>
           <w:sz w:val="24"/>
         </w:rPr>
-        <w:t xml:space="preserve">Điều 5. Nơi nhận: Chủ nhiệm đề tài/NCS; Người hướng dẫn; </w:t>
+        <w:t xml:space="preserve">Điều 5. </w:t>
+      </w:r>
+      <w:r>
+        <w:rPr>
+          <w:rFonts w:ascii="Times New Roman" w:hAnsi="Times New Roman"/>
+          <w:sz w:val="24"/>
+        </w:rPr>
+        <w:t xml:space="preserve">Nơi nhận: Chủ nhiệm đề tài/NCS; Người hướng dẫn; </w:t>
       </w:r>
       <w:r>
         <w:rPr>
@@ -898,7 +933,6 @@
       <w:r>
         <w:rPr>
           <w:rFonts w:ascii="Times New Roman" w:hAnsi="Times New Roman"/>
-          <w:b/>
           <w:sz w:val="24"/>
         </w:rPr>
         <w:t xml:space="preserve">; </w:t>
@@ -915,7 +949,6 @@
       <w:r>
         <w:rPr>
           <w:rFonts w:ascii="Times New Roman" w:hAnsi="Times New Roman"/>
-          <w:b/>
           <w:sz w:val="24"/>
         </w:rPr>
         <w:t>; Lưu Văn thư - HĐ Đạo đức.</w:t>
@@ -928,6 +961,7 @@
       </w:pPr>
       <w:r>
         <w:rPr>
+          <w:rFonts w:ascii="Times New Roman" w:hAnsi="Times New Roman"/>
           <w:b/>
           <w:sz w:val="24"/>
         </w:rPr>
@@ -940,6 +974,7 @@
       </w:pPr>
       <w:r>
         <w:rPr>
+          <w:rFonts w:ascii="Times New Roman" w:hAnsi="Times New Roman"/>
           <w:i/>
           <w:sz w:val="22"/>
         </w:rPr>
@@ -986,7 +1021,7 @@
     </w:p>
     <w:sectPr>
       <w:pgSz w:w="12240" w:h="15840"/>
-      <w:pgMar w:top="1134" w:right="1134" w:bottom="1134" w:left="1417" w:header="720" w:footer="720" w:gutter="0"/>
+      <w:pgMar w:top="1134" w:right="964" w:bottom="1134" w:left="1134" w:header="720" w:footer="720" w:gutter="0"/>
       <w:cols w:space="720"/>
       <w:docGrid w:linePitch="360"/>
     </w:sectPr>

</xml_diff>

<commit_message>
BẢN MẪU in-place: bỏ in đậm cho placeholder đỏ trong body context — chỉ giữ bold cho header cell (TÊN BỘ, TÊN TRƯỜNG, SỐ QĐ, etc theo VN gov convention). Mục đích: người điền chỉ xóa+gõ, KHÔNG phải bỏ format đậm. Rule đã save memory feedback_placeholder_format
</commit_message>
<xml_diff>
--- a/bai-bao-Q1/MauQD_HoiDongDaoDuc_BANMAU_08062026.docx
+++ b/bai-bao-Q1/MauQD_HoiDongDaoDuc_BANMAU_08062026.docx
@@ -148,7 +148,7 @@
             <w:r>
               <w:rPr>
                 <w:rFonts w:ascii="Times New Roman" w:hAnsi="Times New Roman"/>
-                <w:b/>
+                <w:b w:val="0"/>
                 <w:i/>
                 <w:color w:val="C00000"/>
                 <w:sz w:val="22"/>
@@ -166,7 +166,7 @@
             <w:r>
               <w:rPr>
                 <w:rFonts w:ascii="Times New Roman" w:hAnsi="Times New Roman"/>
-                <w:b/>
+                <w:b w:val="0"/>
                 <w:i/>
                 <w:color w:val="C00000"/>
                 <w:sz w:val="22"/>
@@ -184,7 +184,7 @@
             <w:r>
               <w:rPr>
                 <w:rFonts w:ascii="Times New Roman" w:hAnsi="Times New Roman"/>
-                <w:b/>
+                <w:b w:val="0"/>
                 <w:i/>
                 <w:color w:val="C00000"/>
                 <w:sz w:val="22"/>
@@ -202,7 +202,7 @@
             <w:r>
               <w:rPr>
                 <w:rFonts w:ascii="Times New Roman" w:hAnsi="Times New Roman"/>
-                <w:b/>
+                <w:b w:val="0"/>
                 <w:i/>
                 <w:color w:val="C00000"/>
                 <w:sz w:val="22"/>
@@ -296,7 +296,7 @@
       <w:r>
         <w:rPr>
           <w:rFonts w:ascii="Times New Roman" w:hAnsi="Times New Roman"/>
-          <w:b/>
+          <w:b w:val="0"/>
           <w:i/>
           <w:color w:val="C00000"/>
           <w:sz w:val="24"/>
@@ -314,7 +314,7 @@
       <w:r>
         <w:rPr>
           <w:rFonts w:ascii="Times New Roman" w:hAnsi="Times New Roman"/>
-          <w:b/>
+          <w:b w:val="0"/>
           <w:i/>
           <w:color w:val="C00000"/>
           <w:sz w:val="24"/>
@@ -332,7 +332,7 @@
       <w:r>
         <w:rPr>
           <w:rFonts w:ascii="Times New Roman" w:hAnsi="Times New Roman"/>
-          <w:b/>
+          <w:b w:val="0"/>
           <w:i/>
           <w:color w:val="C00000"/>
           <w:sz w:val="24"/>
@@ -350,7 +350,7 @@
       <w:r>
         <w:rPr>
           <w:rFonts w:ascii="Times New Roman" w:hAnsi="Times New Roman"/>
-          <w:b/>
+          <w:b w:val="0"/>
           <w:i/>
           <w:color w:val="C00000"/>
           <w:sz w:val="24"/>
@@ -383,7 +383,7 @@
       <w:r>
         <w:rPr>
           <w:rFonts w:ascii="Times New Roman" w:hAnsi="Times New Roman"/>
-          <w:b/>
+          <w:b w:val="0"/>
           <w:i/>
           <w:color w:val="C00000"/>
           <w:sz w:val="24"/>
@@ -416,7 +416,7 @@
       <w:r>
         <w:rPr>
           <w:rFonts w:ascii="Times New Roman" w:hAnsi="Times New Roman"/>
-          <w:b/>
+          <w:b w:val="0"/>
           <w:i/>
           <w:color w:val="C00000"/>
           <w:sz w:val="24"/>
@@ -434,7 +434,7 @@
       <w:r>
         <w:rPr>
           <w:rFonts w:ascii="Times New Roman" w:hAnsi="Times New Roman"/>
-          <w:b/>
+          <w:b w:val="0"/>
           <w:i/>
           <w:color w:val="C00000"/>
           <w:sz w:val="24"/>
@@ -452,7 +452,7 @@
       <w:r>
         <w:rPr>
           <w:rFonts w:ascii="Times New Roman" w:hAnsi="Times New Roman"/>
-          <w:b/>
+          <w:b w:val="0"/>
           <w:i/>
           <w:color w:val="C00000"/>
           <w:sz w:val="24"/>
@@ -1012,7 +1012,7 @@
       <w:r>
         <w:rPr>
           <w:rFonts w:ascii="Times New Roman" w:hAnsi="Times New Roman"/>
-          <w:b/>
+          <w:b w:val="0"/>
           <w:color w:val="C00000"/>
           <w:sz w:val="24"/>
         </w:rPr>

</xml_diff>